<commit_message>
Corrige relatório do E-fólio Global e regenera PDF
- Seccao 2: distingue as 6 fases do pipeline (main.py) da geracao de codigo final MIPS (codegen_mips.py, entry-point separado)
- Legenda da Figura 1: substitui 'otimizacao da passagem de parametros' por 'efeito da copy propagation sobre os argumentos (param)'
- Seccao 5: substitui o exemplo idealizado por um excerto real gerado (t2 = k - 1 -> lw/li/subu/sw)
- Regenera relatorio Efolioglobal_quadcore.pdf a partir do .docx corrigido
</commit_message>
<xml_diff>
--- a/relatorio Efolioglobal_quadcore.docx
+++ b/relatorio Efolioglobal_quadcore.docx
@@ -572,7 +572,7 @@
           <w:sz w:val="20"/>
           <w:szCs w:val="20"/>
         </w:rPr>
-        <w:t>Esta organização segue a arquitetura clássica apresentada na bibliografia da unidade curricular.</w:t>
+        <w:t>Esta organização segue a arquitetura clássica apresentada na bibliografia da unidade curricular. As fases 1 a 6 são executadas pelo pipeline principal (main.py), que termina no TAC otimizado; a 7.ª fase, a geração de código final em MIPS32, é realizada pelo módulo separado codegen_mips.py, que reexecuta internamente as fases anteriores antes de traduzir o TAC para assembly.</w:t>
       </w:r>
     </w:p>
     <w:p>
@@ -1896,7 +1896,7 @@
           <w:sz w:val="20"/>
           <w:szCs w:val="20"/>
         </w:rPr>
-        <w:t>Exemplo simplificado:</w:t>
+        <w:t>Exemplo de tradução (excerto real gerado a partir de spec_fatorial.mocp):</w:t>
       </w:r>
     </w:p>
     <w:p>
@@ -1933,17 +1933,53 @@
           <w:szCs w:val="20"/>
           <w:highlight w:val="black"/>
         </w:rPr>
-        <w:t>a = 5</w:t>
-      </w:r>
-      <w:r>
+        <w:t>t2 = k - 1</w:t>
+      </w:r>
+    </w:p>
+    <w:p>
+      <w:pPr>
+        <w:spacing w:after="0"/>
+        <w:jc w:val="both"/>
+        <w:rPr>
+          <w:sz w:val="20"/>
+          <w:szCs w:val="20"/>
+        </w:rPr>
+      </w:pPr>
+      <w:r>
+        <w:rPr>
+          <w:sz w:val="20"/>
+          <w:szCs w:val="20"/>
+        </w:rPr>
+        <w:t>MIPS:</w:t>
+      </w:r>
+    </w:p>
+    <w:p>
+      <w:pPr>
+        <w:spacing w:after="0"/>
         <w:rPr>
           <w:color w:val="FFFFFF" w:themeColor="background1"/>
           <w:sz w:val="20"/>
           <w:szCs w:val="20"/>
+        </w:rPr>
+      </w:pPr>
+      <w:r>
+        <w:rPr>
+          <w:color w:val="FFFFFF" w:themeColor="background1"/>
+          <w:sz w:val="20"/>
+          <w:szCs w:val="20"/>
           <w:highlight w:val="black"/>
         </w:rPr>
+        <w:t>lw $t0, -32($fp)</w:t>
+      </w:r>
+      <w:r>
+        <w:rPr>
+          <w:color w:val="FFFFFF" w:themeColor="background1"/>
+          <w:sz w:val="20"/>
+          <w:szCs w:val="20"/>
+          <w:highlight w:val="black"/>
+        </w:rPr>
         <w:br/>
-        <w:t>b = 3</w:t>
+        <w:t>li $t1, 1</w:t>
       </w:r>
       <w:r>
         <w:rPr>
@@ -1953,80 +1989,34 @@
           <w:highlight w:val="black"/>
         </w:rPr>
         <w:br/>
-        <w:t>t1 = a + b</w:t>
-      </w:r>
-    </w:p>
-    <w:p>
-      <w:pPr>
-        <w:spacing w:after="0"/>
-        <w:jc w:val="both"/>
-        <w:rPr>
-          <w:sz w:val="20"/>
-          <w:szCs w:val="20"/>
-        </w:rPr>
-      </w:pPr>
-      <w:r>
-        <w:rPr>
-          <w:sz w:val="20"/>
-          <w:szCs w:val="20"/>
-        </w:rPr>
-        <w:t>MIPS:</w:t>
-      </w:r>
-    </w:p>
-    <w:p>
-      <w:pPr>
-        <w:spacing w:after="0"/>
+        <w:t>subu $t2, $t0, $t1</w:t>
+      </w:r>
+      <w:r>
         <w:rPr>
           <w:color w:val="FFFFFF" w:themeColor="background1"/>
           <w:sz w:val="20"/>
           <w:szCs w:val="20"/>
-        </w:rPr>
-      </w:pPr>
-      <w:r>
-        <w:rPr>
-          <w:color w:val="FFFFFF" w:themeColor="background1"/>
-          <w:sz w:val="20"/>
-          <w:szCs w:val="20"/>
           <w:highlight w:val="black"/>
         </w:rPr>
-        <w:t>li $t0, 5</w:t>
-      </w:r>
-      <w:r>
-        <w:rPr>
-          <w:color w:val="FFFFFF" w:themeColor="background1"/>
-          <w:sz w:val="20"/>
-          <w:szCs w:val="20"/>
-          <w:highlight w:val="black"/>
-        </w:rPr>
         <w:br/>
-        <w:t>li $t1, 3</w:t>
-      </w:r>
-      <w:r>
-        <w:rPr>
-          <w:color w:val="FFFFFF" w:themeColor="background1"/>
-          <w:sz w:val="20"/>
-          <w:szCs w:val="20"/>
-          <w:highlight w:val="black"/>
-        </w:rPr>
-        <w:br/>
-        <w:t>add $t2, $t0, $t1</w:t>
-      </w:r>
-    </w:p>
-    <w:p>
-      <w:pPr>
-        <w:spacing w:after="0"/>
-        <w:jc w:val="both"/>
-        <w:rPr>
-          <w:sz w:val="20"/>
-          <w:szCs w:val="20"/>
-        </w:rPr>
-      </w:pPr>
-      <w:r>
-        <w:rPr>
-          <w:sz w:val="20"/>
-          <w:szCs w:val="20"/>
-        </w:rPr>
-        <w:t>Este exemplo ilustra a tradução direta de operações aritméticas do TAC para instruções MIPS32.</w:t>
+        <w:t>sw $t2, -24($fp)</w:t>
+      </w:r>
+    </w:p>
+    <w:p>
+      <w:pPr>
+        <w:spacing w:after="0"/>
+        <w:jc w:val="both"/>
+        <w:rPr>
+          <w:sz w:val="20"/>
+          <w:szCs w:val="20"/>
+        </w:rPr>
+      </w:pPr>
+      <w:r>
+        <w:rPr>
+          <w:sz w:val="20"/>
+          <w:szCs w:val="20"/>
+        </w:rPr>
+        <w:t>Este é um excerto real do código gerado: cada operando é trazido para um registo (lw a partir da pilha, relativo a $fp, ou li quando é um literal), a operação aritmética é aplicada (aqui subu, para a subtração) e o resultado é guardado de volta na pilha com sw. Quando ambos os operandos são literais, o otimizador aplica constant folding e a operação nem chega a ser emitida.</w:t>
       </w:r>
     </w:p>
     <w:p>
@@ -2678,7 +2668,7 @@
           <w:sz w:val="20"/>
           <w:szCs w:val="20"/>
         </w:rPr>
-        <w:t xml:space="preserve"> – Exemplo de TAC gerado para o programa spec_fatorial.mocp, evidenciando a receção explícita de parâmetros através de getparam, a inicialização automática de variáveis e a otimização da passagem de parâmetros.</w:t>
+        <w:t xml:space="preserve"> – Exemplo de TAC gerado para o programa spec_fatorial.mocp, evidenciando a receção explícita de parâmetros através de getparam, a inicialização automática de variáveis e o efeito da copy propagation sobre os argumentos (param).</w:t>
       </w:r>
     </w:p>
     <w:p>

</xml_diff>